<commit_message>
Adicionei QRCODE e site funcionau!
</commit_message>
<xml_diff>
--- a/modelos/criacao-empresa.docx
+++ b/modelos/criacao-empresa.docx
@@ -551,11 +551,7 @@
       </w:r>
       <w:r>
         <w:rPr/>
-        <w:t>[[ATIVIDADE_ECONOMICA</w:t>
-      </w:r>
-      <w:r>
-        <w:rPr/>
-        <w:t>]]</w:t>
+        <w:t>[[ATIVIDADE_ECONOMICA]]</w:t>
       </w:r>
     </w:p>
     <w:p>
@@ -1197,276 +1193,30 @@
         <w:widowControl w:val="false"/>
         <w:shd w:val="clear" w:fill="auto"/>
         <w:spacing w:lineRule="auto" w:line="240" w:before="200" w:after="0"/>
-        <w:ind w:hanging="0" w:start="32" w:end="0"/>
-        <w:jc w:val="start"/>
-        <w:rPr>
-          <w:rFonts w:ascii="Arial" w:hAnsi="Arial" w:eastAsia="Arial" w:cs="Arial"/>
-          <w:b/>
-          <w:bCs/>
-          <w:i w:val="false"/>
-          <w:iCs w:val="false"/>
-          <w:caps w:val="false"/>
-          <w:smallCaps w:val="false"/>
-          <w:strike w:val="false"/>
-          <w:dstrike w:val="false"/>
-          <w:color w:val="000000"/>
-          <w:position w:val="0"/>
-          <w:sz w:val="24"/>
-          <w:szCs w:val="24"/>
-          <w:u w:val="none"/>
-          <w:shd w:fill="auto" w:val="clear"/>
-          <w:vertAlign w:val="baseline"/>
-        </w:rPr>
-      </w:pPr>
-      <w:r>
-        <w:rPr>
-          <w:rFonts w:eastAsia="Arial" w:cs="Arial"/>
-          <w:b/>
-          <w:bCs/>
-          <w:i w:val="false"/>
-          <w:iCs w:val="false"/>
-          <w:caps w:val="false"/>
-          <w:smallCaps w:val="false"/>
-          <w:strike w:val="false"/>
-          <w:dstrike w:val="false"/>
-          <w:color w:val="000000"/>
-          <w:position w:val="0"/>
-          <w:sz w:val="24"/>
-          <w:szCs w:val="24"/>
-          <w:u w:val="none"/>
-          <w:shd w:fill="auto" w:val="clear"/>
-          <w:vertAlign w:val="baseline"/>
-        </w:rPr>
-      </w:r>
-    </w:p>
-    <w:p>
-      <w:pPr>
-        <w:pStyle w:val="normal1"/>
-        <w:widowControl w:val="false"/>
-        <w:shd w:val="clear" w:fill="auto"/>
-        <w:spacing w:lineRule="auto" w:line="240" w:before="200" w:after="0"/>
-        <w:ind w:hanging="0" w:start="32" w:end="0"/>
-        <w:jc w:val="start"/>
-        <w:rPr>
-          <w:rFonts w:ascii="Arial" w:hAnsi="Arial" w:eastAsia="Arial" w:cs="Arial"/>
-          <w:b/>
-          <w:bCs/>
-          <w:i w:val="false"/>
-          <w:iCs w:val="false"/>
-          <w:caps w:val="false"/>
-          <w:smallCaps w:val="false"/>
-          <w:strike w:val="false"/>
-          <w:dstrike w:val="false"/>
-          <w:color w:val="000000"/>
-          <w:position w:val="0"/>
-          <w:sz w:val="24"/>
-          <w:szCs w:val="24"/>
-          <w:u w:val="none"/>
-          <w:shd w:fill="auto" w:val="clear"/>
-          <w:vertAlign w:val="baseline"/>
-        </w:rPr>
-      </w:pPr>
-      <w:r>
-        <w:rPr>
-          <w:rFonts w:eastAsia="Arial" w:cs="Arial"/>
-          <w:b/>
-          <w:bCs/>
-          <w:i w:val="false"/>
-          <w:iCs w:val="false"/>
-          <w:caps w:val="false"/>
-          <w:smallCaps w:val="false"/>
-          <w:strike w:val="false"/>
-          <w:dstrike w:val="false"/>
-          <w:color w:val="000000"/>
-          <w:position w:val="0"/>
-          <w:sz w:val="24"/>
-          <w:szCs w:val="24"/>
-          <w:u w:val="none"/>
-          <w:shd w:fill="auto" w:val="clear"/>
-          <w:vertAlign w:val="baseline"/>
-        </w:rPr>
-      </w:r>
-    </w:p>
-    <w:p>
-      <w:pPr>
-        <w:pStyle w:val="normal1"/>
-        <w:widowControl w:val="false"/>
-        <w:shd w:val="clear" w:fill="auto"/>
-        <w:spacing w:lineRule="auto" w:line="240" w:before="200" w:after="0"/>
-        <w:ind w:hanging="0" w:start="32" w:end="0"/>
-        <w:jc w:val="start"/>
-        <w:rPr>
-          <w:rFonts w:ascii="Arial" w:hAnsi="Arial" w:eastAsia="Arial" w:cs="Arial"/>
-          <w:b/>
-          <w:bCs/>
-          <w:i w:val="false"/>
-          <w:iCs w:val="false"/>
-          <w:caps w:val="false"/>
-          <w:smallCaps w:val="false"/>
-          <w:strike w:val="false"/>
-          <w:dstrike w:val="false"/>
-          <w:color w:val="000000"/>
-          <w:position w:val="0"/>
-          <w:sz w:val="24"/>
-          <w:szCs w:val="24"/>
-          <w:u w:val="none"/>
-          <w:shd w:fill="auto" w:val="clear"/>
-          <w:vertAlign w:val="baseline"/>
-        </w:rPr>
-      </w:pPr>
-      <w:r>
-        <w:rPr>
-          <w:rFonts w:eastAsia="Arial" w:cs="Arial"/>
-          <w:b/>
-          <w:bCs/>
-          <w:i w:val="false"/>
-          <w:iCs w:val="false"/>
-          <w:caps w:val="false"/>
-          <w:smallCaps w:val="false"/>
-          <w:strike w:val="false"/>
-          <w:dstrike w:val="false"/>
-          <w:color w:val="000000"/>
-          <w:position w:val="0"/>
-          <w:sz w:val="24"/>
-          <w:szCs w:val="24"/>
-          <w:u w:val="none"/>
-          <w:shd w:fill="auto" w:val="clear"/>
-          <w:vertAlign w:val="baseline"/>
-        </w:rPr>
-      </w:r>
-    </w:p>
-    <w:p>
-      <w:pPr>
-        <w:pStyle w:val="normal1"/>
-        <w:widowControl w:val="false"/>
-        <w:shd w:val="clear" w:fill="auto"/>
-        <w:spacing w:lineRule="auto" w:line="240" w:before="200" w:after="0"/>
-        <w:ind w:hanging="0" w:start="32" w:end="0"/>
-        <w:jc w:val="start"/>
-        <w:rPr>
-          <w:rFonts w:ascii="Arial" w:hAnsi="Arial" w:eastAsia="Arial" w:cs="Arial"/>
-          <w:b/>
-          <w:bCs/>
-          <w:i w:val="false"/>
-          <w:iCs w:val="false"/>
-          <w:caps w:val="false"/>
-          <w:smallCaps w:val="false"/>
-          <w:strike w:val="false"/>
-          <w:dstrike w:val="false"/>
-          <w:color w:val="000000"/>
-          <w:position w:val="0"/>
-          <w:sz w:val="24"/>
-          <w:szCs w:val="24"/>
-          <w:u w:val="none"/>
-          <w:shd w:fill="auto" w:val="clear"/>
-          <w:vertAlign w:val="baseline"/>
-        </w:rPr>
-      </w:pPr>
-      <w:r>
-        <w:rPr>
-          <w:rFonts w:eastAsia="Arial" w:cs="Arial"/>
-          <w:b/>
-          <w:bCs/>
-          <w:i w:val="false"/>
-          <w:iCs w:val="false"/>
-          <w:caps w:val="false"/>
-          <w:smallCaps w:val="false"/>
-          <w:strike w:val="false"/>
-          <w:dstrike w:val="false"/>
-          <w:color w:val="000000"/>
-          <w:position w:val="0"/>
-          <w:sz w:val="24"/>
-          <w:szCs w:val="24"/>
-          <w:u w:val="none"/>
-          <w:shd w:fill="auto" w:val="clear"/>
-          <w:vertAlign w:val="baseline"/>
-        </w:rPr>
-      </w:r>
-    </w:p>
-    <w:p>
-      <w:pPr>
-        <w:pStyle w:val="normal1"/>
-        <w:widowControl w:val="false"/>
-        <w:shd w:val="clear" w:fill="auto"/>
-        <w:spacing w:lineRule="auto" w:line="240" w:before="200" w:after="0"/>
-        <w:ind w:hanging="0" w:start="32" w:end="0"/>
-        <w:jc w:val="start"/>
-        <w:rPr>
-          <w:rFonts w:ascii="Arial" w:hAnsi="Arial" w:eastAsia="Arial" w:cs="Arial"/>
-          <w:b/>
-          <w:bCs/>
-          <w:i w:val="false"/>
-          <w:iCs w:val="false"/>
-          <w:caps w:val="false"/>
-          <w:smallCaps w:val="false"/>
-          <w:strike w:val="false"/>
-          <w:dstrike w:val="false"/>
-          <w:color w:val="000000"/>
-          <w:position w:val="0"/>
-          <w:sz w:val="24"/>
-          <w:szCs w:val="24"/>
-          <w:u w:val="none"/>
-          <w:shd w:fill="auto" w:val="clear"/>
-          <w:vertAlign w:val="baseline"/>
-        </w:rPr>
-      </w:pPr>
-      <w:r>
-        <w:rPr>
-          <w:rFonts w:eastAsia="Arial" w:cs="Arial"/>
-          <w:b/>
-          <w:bCs/>
-          <w:i w:val="false"/>
-          <w:iCs w:val="false"/>
-          <w:caps w:val="false"/>
-          <w:smallCaps w:val="false"/>
-          <w:strike w:val="false"/>
-          <w:dstrike w:val="false"/>
-          <w:color w:val="000000"/>
-          <w:position w:val="0"/>
-          <w:sz w:val="24"/>
-          <w:szCs w:val="24"/>
-          <w:u w:val="none"/>
-          <w:shd w:fill="auto" w:val="clear"/>
-          <w:vertAlign w:val="baseline"/>
-        </w:rPr>
-      </w:r>
-    </w:p>
-    <w:p>
-      <w:pPr>
-        <w:pStyle w:val="normal1"/>
-        <w:widowControl w:val="false"/>
-        <w:shd w:val="clear" w:fill="auto"/>
-        <w:spacing w:lineRule="auto" w:line="240" w:before="200" w:after="0"/>
-        <w:ind w:hanging="0" w:start="32" w:end="0"/>
-        <w:jc w:val="start"/>
-        <w:rPr>
-          <w:rFonts w:ascii="Arial" w:hAnsi="Arial" w:eastAsia="Arial" w:cs="Arial"/>
-          <w:b/>
-          <w:bCs/>
-          <w:i w:val="false"/>
-          <w:iCs w:val="false"/>
-          <w:caps w:val="false"/>
-          <w:smallCaps w:val="false"/>
-          <w:strike w:val="false"/>
-          <w:dstrike w:val="false"/>
-          <w:color w:val="000000"/>
-          <w:position w:val="0"/>
-          <w:sz w:val="24"/>
-          <w:szCs w:val="24"/>
-          <w:u w:val="none"/>
-          <w:shd w:fill="auto" w:val="clear"/>
-          <w:vertAlign w:val="baseline"/>
-        </w:rPr>
-      </w:pPr>
-      <w:r>
-        <w:rPr>
-          <w:b/>
-          <w:bCs/>
-          <w:sz w:val="24"/>
-          <w:szCs w:val="24"/>
-        </w:rPr>
-        <w:tab/>
-        <w:t>_____________________________                              _____________________________</w:t>
+        <w:ind w:hanging="0" w:start="0" w:end="0"/>
+        <w:jc w:val="start"/>
+        <w:rPr/>
+      </w:pPr>
+      <w:r>
+        <w:rPr>
+          <w:b/>
+          <w:bCs/>
+          <w:i w:val="false"/>
+          <w:iCs w:val="false"/>
+          <w:color w:val="111111"/>
+        </w:rPr>
+        <w:t xml:space="preserve">     </w:t>
+      </w:r>
+      <w:r>
+        <w:rPr>
+          <w:rFonts w:ascii="Open Sans" w:hAnsi="Open Sans"/>
+          <w:b/>
+          <w:bCs/>
+          <w:i w:val="false"/>
+          <w:iCs w:val="false"/>
+          <w:color w:val="111111"/>
+        </w:rPr>
+        <w:t>Verificação</w:t>
       </w:r>
     </w:p>
     <w:p>
@@ -1476,34 +1226,12 @@
         <w:shd w:val="clear" w:fill="auto"/>
         <w:spacing w:lineRule="auto" w:line="240" w:before="200" w:after="0"/>
         <w:ind w:hanging="0" w:start="0" w:end="0"/>
-        <w:jc w:val="center"/>
-        <w:rPr>
-          <w:rFonts w:ascii="Arial" w:hAnsi="Arial" w:eastAsia="Arial" w:cs="Arial"/>
-          <w:b/>
-          <w:bCs/>
-          <w:i w:val="false"/>
-          <w:iCs w:val="false"/>
-          <w:caps w:val="false"/>
-          <w:smallCaps w:val="false"/>
-          <w:strike w:val="false"/>
-          <w:dstrike w:val="false"/>
-          <w:color w:val="000000"/>
-          <w:position w:val="0"/>
-          <w:sz w:val="24"/>
-          <w:szCs w:val="24"/>
-          <w:u w:val="none"/>
-          <w:shd w:fill="auto" w:val="clear"/>
-          <w:vertAlign w:val="baseline"/>
-        </w:rPr>
-      </w:pPr>
-      <w:r>
-        <w:rPr>
-          <w:b/>
-          <w:bCs/>
-          <w:sz w:val="24"/>
-          <w:szCs w:val="24"/>
-        </w:rPr>
-        <w:t>Funcionário Responsável                                                  Sócio Responsável</w:t>
+        <w:jc w:val="start"/>
+        <w:rPr/>
+      </w:pPr>
+      <w:r>
+        <w:rPr/>
+        <w:t>[[QR_CODE]]</w:t>
       </w:r>
     </w:p>
     <w:sectPr>

</xml_diff>

<commit_message>
Atualizar modelo de criação de empresa
</commit_message>
<xml_diff>
--- a/modelos/criacao-empresa.docx
+++ b/modelos/criacao-empresa.docx
@@ -327,7 +327,7 @@
           <w:shd w:fill="auto" w:val="clear"/>
           <w:vertAlign w:val="baseline"/>
         </w:rPr>
-        <w:t>---------------------------------------------------------------------------------------------------------------------------------------</w:t>
+        <w:t>------------------------------------------------------------------------------------------------------------------------------------</w:t>
       </w:r>
     </w:p>
     <w:p>
@@ -664,62 +664,6 @@
       <w:r>
         <w:rPr/>
         <w:t>[[FUNDADORES]]</w:t>
-      </w:r>
-    </w:p>
-    <w:p>
-      <w:pPr>
-        <w:pStyle w:val="normal1"/>
-        <w:keepNext w:val="false"/>
-        <w:keepLines w:val="false"/>
-        <w:pageBreakBefore w:val="false"/>
-        <w:widowControl w:val="false"/>
-        <w:shd w:val="clear" w:fill="auto"/>
-        <w:spacing w:lineRule="auto" w:line="240" w:before="200" w:after="0"/>
-        <w:ind w:hanging="0" w:start="32" w:end="0"/>
-        <w:jc w:val="start"/>
-        <w:rPr>
-          <w:rFonts w:ascii="Arial" w:hAnsi="Arial" w:eastAsia="Arial" w:cs="Arial"/>
-          <w:b/>
-          <w:bCs/>
-          <w:i w:val="false"/>
-          <w:iCs w:val="false"/>
-          <w:caps w:val="false"/>
-          <w:smallCaps w:val="false"/>
-          <w:strike w:val="false"/>
-          <w:dstrike w:val="false"/>
-          <w:color w:val="000000"/>
-          <w:position w:val="0"/>
-          <w:sz w:val="24"/>
-          <w:szCs w:val="24"/>
-          <w:u w:val="none"/>
-          <w:shd w:fill="auto" w:val="clear"/>
-          <w:vertAlign w:val="baseline"/>
-        </w:rPr>
-      </w:pPr>
-      <w:r>
-        <w:rPr>
-          <w:rFonts w:eastAsia="Arial" w:cs="Arial"/>
-          <w:b/>
-          <w:bCs/>
-          <w:i w:val="false"/>
-          <w:iCs w:val="false"/>
-          <w:caps w:val="false"/>
-          <w:smallCaps w:val="false"/>
-          <w:strike w:val="false"/>
-          <w:dstrike w:val="false"/>
-          <w:color w:val="000000"/>
-          <w:position w:val="0"/>
-          <w:sz w:val="24"/>
-          <w:szCs w:val="24"/>
-          <w:u w:val="none"/>
-          <w:shd w:fill="auto" w:val="clear"/>
-          <w:vertAlign w:val="baseline"/>
-        </w:rPr>
-        <w:t xml:space="preserve">Sócios: </w:t>
-      </w:r>
-      <w:r>
-        <w:rPr/>
-        <w:t>[[SOCIOS]]</w:t>
       </w:r>
     </w:p>
     <w:p>

</xml_diff>